<commit_message>
Show a clearer message when the account has no access
When the API refuses a login that it never accepted (for example the user
lacks OIDC_REQUIRED_ROLE), the login page now says "Your account does not
provide access. Contact your system administrator for details." A login that
worked and is later refused still shows "Your session has ended. Sign in
again." Whether a login was accepted is kept in the tab's session storage.
The Keycloak user guide is updated to match.

Co-Authored-By: Claude Sonnet 5.5 <noreply@anthropic.com>
</commit_message>
<xml_diff>
--- a/doc/MLW_Keycloak.docx
+++ b/doc/MLW_Keycloak.docx
@@ -102,7 +102,7 @@
             </w:rPr>
             <w:fldChar w:fldCharType="separate"/>
           </w:r>
-          <w:hyperlink w:anchor="__RefHeading___Toc507_1834084466">
+          <w:hyperlink w:anchor="__RefHeading___Toc507_567877476">
             <w:r>
               <w:rPr>
                 <w:rStyle w:val="IndexLink"/>
@@ -122,7 +122,7 @@
             </w:tabs>
             <w:rPr/>
           </w:pPr>
-          <w:hyperlink w:anchor="__RefHeading___Toc509_1834084466">
+          <w:hyperlink w:anchor="__RefHeading___Toc509_567877476">
             <w:r>
               <w:rPr>
                 <w:rStyle w:val="IndexLink"/>
@@ -142,7 +142,7 @@
             </w:tabs>
             <w:rPr/>
           </w:pPr>
-          <w:hyperlink w:anchor="__RefHeading___Toc511_1834084466">
+          <w:hyperlink w:anchor="__RefHeading___Toc511_567877476">
             <w:r>
               <w:rPr>
                 <w:rStyle w:val="IndexLink"/>
@@ -162,7 +162,7 @@
             </w:tabs>
             <w:rPr/>
           </w:pPr>
-          <w:hyperlink w:anchor="__RefHeading___Toc513_1834084466">
+          <w:hyperlink w:anchor="__RefHeading___Toc513_567877476">
             <w:r>
               <w:rPr>
                 <w:rStyle w:val="IndexLink"/>
@@ -182,7 +182,7 @@
             </w:tabs>
             <w:rPr/>
           </w:pPr>
-          <w:hyperlink w:anchor="__RefHeading___Toc515_1834084466">
+          <w:hyperlink w:anchor="__RefHeading___Toc515_567877476">
             <w:r>
               <w:rPr>
                 <w:rStyle w:val="IndexLink"/>
@@ -202,7 +202,7 @@
             </w:tabs>
             <w:rPr/>
           </w:pPr>
-          <w:hyperlink w:anchor="__RefHeading___Toc517_1834084466">
+          <w:hyperlink w:anchor="__RefHeading___Toc517_567877476">
             <w:r>
               <w:rPr>
                 <w:rStyle w:val="IndexLink"/>
@@ -222,7 +222,7 @@
             </w:tabs>
             <w:rPr/>
           </w:pPr>
-          <w:hyperlink w:anchor="__RefHeading___Toc519_1834084466">
+          <w:hyperlink w:anchor="__RefHeading___Toc519_567877476">
             <w:r>
               <w:rPr>
                 <w:rStyle w:val="IndexLink"/>
@@ -242,7 +242,7 @@
             </w:tabs>
             <w:rPr/>
           </w:pPr>
-          <w:hyperlink w:anchor="__RefHeading___Toc521_1834084466">
+          <w:hyperlink w:anchor="__RefHeading___Toc521_567877476">
             <w:r>
               <w:rPr>
                 <w:rStyle w:val="IndexLink"/>
@@ -262,7 +262,7 @@
             </w:tabs>
             <w:rPr/>
           </w:pPr>
-          <w:hyperlink w:anchor="__RefHeading___Toc523_1834084466">
+          <w:hyperlink w:anchor="__RefHeading___Toc523_567877476">
             <w:r>
               <w:rPr>
                 <w:rStyle w:val="IndexLink"/>
@@ -282,7 +282,7 @@
             </w:tabs>
             <w:rPr/>
           </w:pPr>
-          <w:hyperlink w:anchor="__RefHeading___Toc525_1834084466">
+          <w:hyperlink w:anchor="__RefHeading___Toc525_567877476">
             <w:r>
               <w:rPr>
                 <w:rStyle w:val="IndexLink"/>
@@ -302,7 +302,7 @@
             </w:tabs>
             <w:rPr/>
           </w:pPr>
-          <w:hyperlink w:anchor="__RefHeading___Toc527_1834084466">
+          <w:hyperlink w:anchor="__RefHeading___Toc527_567877476">
             <w:r>
               <w:rPr>
                 <w:rStyle w:val="IndexLink"/>
@@ -322,7 +322,7 @@
             </w:tabs>
             <w:rPr/>
           </w:pPr>
-          <w:hyperlink w:anchor="__RefHeading___Toc529_1834084466">
+          <w:hyperlink w:anchor="__RefHeading___Toc529_567877476">
             <w:r>
               <w:rPr>
                 <w:rStyle w:val="IndexLink"/>
@@ -342,7 +342,7 @@
             </w:tabs>
             <w:rPr/>
           </w:pPr>
-          <w:hyperlink w:anchor="__RefHeading___Toc531_1834084466">
+          <w:hyperlink w:anchor="__RefHeading___Toc531_567877476">
             <w:r>
               <w:rPr>
                 <w:rStyle w:val="IndexLink"/>
@@ -362,7 +362,7 @@
             </w:tabs>
             <w:rPr/>
           </w:pPr>
-          <w:hyperlink w:anchor="__RefHeading___Toc533_1834084466">
+          <w:hyperlink w:anchor="__RefHeading___Toc533_567877476">
             <w:r>
               <w:rPr>
                 <w:rStyle w:val="IndexLink"/>
@@ -382,7 +382,7 @@
             </w:tabs>
             <w:rPr/>
           </w:pPr>
-          <w:hyperlink w:anchor="__RefHeading___Toc535_1834084466">
+          <w:hyperlink w:anchor="__RefHeading___Toc535_567877476">
             <w:r>
               <w:rPr>
                 <w:rStyle w:val="IndexLink"/>
@@ -402,7 +402,7 @@
             </w:tabs>
             <w:rPr/>
           </w:pPr>
-          <w:hyperlink w:anchor="__RefHeading___Toc537_1834084466">
+          <w:hyperlink w:anchor="__RefHeading___Toc537_567877476">
             <w:r>
               <w:rPr>
                 <w:rStyle w:val="IndexLink"/>
@@ -422,7 +422,7 @@
             </w:tabs>
             <w:rPr/>
           </w:pPr>
-          <w:hyperlink w:anchor="__RefHeading___Toc539_1834084466">
+          <w:hyperlink w:anchor="__RefHeading___Toc539_567877476">
             <w:r>
               <w:rPr>
                 <w:rStyle w:val="IndexLink"/>
@@ -442,7 +442,7 @@
             </w:tabs>
             <w:rPr/>
           </w:pPr>
-          <w:hyperlink w:anchor="__RefHeading___Toc541_1834084466">
+          <w:hyperlink w:anchor="__RefHeading___Toc541_567877476">
             <w:r>
               <w:rPr>
                 <w:rStyle w:val="IndexLink"/>
@@ -462,7 +462,7 @@
             </w:tabs>
             <w:rPr/>
           </w:pPr>
-          <w:hyperlink w:anchor="__RefHeading___Toc543_1834084466">
+          <w:hyperlink w:anchor="__RefHeading___Toc543_567877476">
             <w:r>
               <w:rPr>
                 <w:rStyle w:val="IndexLink"/>
@@ -482,7 +482,7 @@
             </w:tabs>
             <w:rPr/>
           </w:pPr>
-          <w:hyperlink w:anchor="__RefHeading___Toc545_1834084466">
+          <w:hyperlink w:anchor="__RefHeading___Toc545_567877476">
             <w:r>
               <w:rPr>
                 <w:rStyle w:val="IndexLink"/>
@@ -523,7 +523,7 @@
         <w:keepNext w:val="true"/>
         <w:rPr/>
       </w:pPr>
-      <w:bookmarkStart w:id="0" w:name="__RefHeading___Toc507_1834084466"/>
+      <w:bookmarkStart w:id="0" w:name="__RefHeading___Toc507_567877476"/>
       <w:bookmarkEnd w:id="0"/>
       <w:r>
         <w:rPr/>
@@ -1317,7 +1317,7 @@
         <w:keepNext w:val="true"/>
         <w:rPr/>
       </w:pPr>
-      <w:bookmarkStart w:id="1" w:name="__RefHeading___Toc509_1834084466"/>
+      <w:bookmarkStart w:id="1" w:name="__RefHeading___Toc509_567877476"/>
       <w:bookmarkEnd w:id="1"/>
       <w:r>
         <w:rPr/>
@@ -1330,7 +1330,7 @@
         <w:keepNext w:val="true"/>
         <w:rPr/>
       </w:pPr>
-      <w:bookmarkStart w:id="2" w:name="__RefHeading___Toc511_1834084466"/>
+      <w:bookmarkStart w:id="2" w:name="__RefHeading___Toc511_567877476"/>
       <w:bookmarkEnd w:id="2"/>
       <w:r>
         <w:rPr/>
@@ -1526,7 +1526,7 @@
         <w:keepNext w:val="true"/>
         <w:rPr/>
       </w:pPr>
-      <w:bookmarkStart w:id="3" w:name="__RefHeading___Toc513_1834084466"/>
+      <w:bookmarkStart w:id="3" w:name="__RefHeading___Toc513_567877476"/>
       <w:bookmarkEnd w:id="3"/>
       <w:r>
         <w:rPr/>
@@ -1994,7 +1994,7 @@
         <w:keepNext w:val="true"/>
         <w:rPr/>
       </w:pPr>
-      <w:bookmarkStart w:id="4" w:name="__RefHeading___Toc515_1834084466"/>
+      <w:bookmarkStart w:id="4" w:name="__RefHeading___Toc515_567877476"/>
       <w:bookmarkEnd w:id="4"/>
       <w:r>
         <w:rPr/>
@@ -2018,7 +2018,7 @@
         <w:keepNext w:val="true"/>
         <w:rPr/>
       </w:pPr>
-      <w:bookmarkStart w:id="5" w:name="__RefHeading___Toc517_1834084466"/>
+      <w:bookmarkStart w:id="5" w:name="__RefHeading___Toc517_567877476"/>
       <w:bookmarkEnd w:id="5"/>
       <w:r>
         <w:rPr/>
@@ -2443,7 +2443,7 @@
         <w:keepNext w:val="true"/>
         <w:rPr/>
       </w:pPr>
-      <w:bookmarkStart w:id="6" w:name="__RefHeading___Toc519_1834084466"/>
+      <w:bookmarkStart w:id="6" w:name="__RefHeading___Toc519_567877476"/>
       <w:bookmarkEnd w:id="6"/>
       <w:r>
         <w:rPr/>
@@ -2534,7 +2534,7 @@
         <w:keepNext w:val="true"/>
         <w:rPr/>
       </w:pPr>
-      <w:bookmarkStart w:id="7" w:name="__RefHeading___Toc521_1834084466"/>
+      <w:bookmarkStart w:id="7" w:name="__RefHeading___Toc521_567877476"/>
       <w:bookmarkEnd w:id="7"/>
       <w:r>
         <w:rPr/>
@@ -2603,7 +2603,7 @@
         <w:keepNext w:val="true"/>
         <w:rPr/>
       </w:pPr>
-      <w:bookmarkStart w:id="8" w:name="__RefHeading___Toc523_1834084466"/>
+      <w:bookmarkStart w:id="8" w:name="__RefHeading___Toc523_567877476"/>
       <w:bookmarkEnd w:id="8"/>
       <w:r>
         <w:rPr/>
@@ -2627,7 +2627,7 @@
         <w:keepNext w:val="true"/>
         <w:rPr/>
       </w:pPr>
-      <w:bookmarkStart w:id="9" w:name="__RefHeading___Toc525_1834084466"/>
+      <w:bookmarkStart w:id="9" w:name="__RefHeading___Toc525_567877476"/>
       <w:bookmarkEnd w:id="9"/>
       <w:r>
         <w:rPr/>
@@ -2651,7 +2651,7 @@
         <w:keepNext w:val="true"/>
         <w:rPr/>
       </w:pPr>
-      <w:bookmarkStart w:id="10" w:name="__RefHeading___Toc527_1834084466"/>
+      <w:bookmarkStart w:id="10" w:name="__RefHeading___Toc527_567877476"/>
       <w:bookmarkEnd w:id="10"/>
       <w:r>
         <w:rPr/>
@@ -2860,7 +2860,7 @@
         <w:keepNext w:val="true"/>
         <w:rPr/>
       </w:pPr>
-      <w:bookmarkStart w:id="11" w:name="__RefHeading___Toc529_1834084466"/>
+      <w:bookmarkStart w:id="11" w:name="__RefHeading___Toc529_567877476"/>
       <w:bookmarkEnd w:id="11"/>
       <w:r>
         <w:rPr/>
@@ -3137,7 +3137,7 @@
         <w:keepNext w:val="true"/>
         <w:rPr/>
       </w:pPr>
-      <w:bookmarkStart w:id="12" w:name="__RefHeading___Toc531_1834084466"/>
+      <w:bookmarkStart w:id="12" w:name="__RefHeading___Toc531_567877476"/>
       <w:bookmarkEnd w:id="12"/>
       <w:r>
         <w:rPr/>
@@ -3425,7 +3425,7 @@
         <w:keepNext w:val="true"/>
         <w:rPr/>
       </w:pPr>
-      <w:bookmarkStart w:id="13" w:name="__RefHeading___Toc533_1834084466"/>
+      <w:bookmarkStart w:id="13" w:name="__RefHeading___Toc533_567877476"/>
       <w:bookmarkEnd w:id="13"/>
       <w:r>
         <w:rPr/>
@@ -3688,7 +3688,7 @@
         <w:keepNext w:val="true"/>
         <w:rPr/>
       </w:pPr>
-      <w:bookmarkStart w:id="14" w:name="__RefHeading___Toc535_1834084466"/>
+      <w:bookmarkStart w:id="14" w:name="__RefHeading___Toc535_567877476"/>
       <w:bookmarkEnd w:id="14"/>
       <w:r>
         <w:rPr/>
@@ -3764,7 +3764,7 @@
         <w:keepNext w:val="true"/>
         <w:rPr/>
       </w:pPr>
-      <w:bookmarkStart w:id="15" w:name="__RefHeading___Toc537_1834084466"/>
+      <w:bookmarkStart w:id="15" w:name="__RefHeading___Toc537_567877476"/>
       <w:bookmarkEnd w:id="15"/>
       <w:r>
         <w:rPr/>
@@ -3881,7 +3881,7 @@
       </w:pPr>
       <w:r>
         <w:rPr/>
-        <w:t>A user without the role can still sign in at Keycloak, because the account is valid, but the application refuses every request. The person lands on the login page again, with the message “Your session has ended. Sign in again.” Signing in again does not help. The fix is to give the user the role (section 4.4).</w:t>
+        <w:t>A user without the role can still sign in at Keycloak, because the account is valid, but the application refuses every request. The person lands on the login page again, with the message “Your account does not provide access. Contact your system administrator for details.” Signing in again does not help. The fix is to give the user the role (section 4.4).</w:t>
       </w:r>
     </w:p>
     <w:p>
@@ -3896,7 +3896,7 @@
         <w:rPr/>
         <w:drawing>
           <wp:inline distT="0" distB="0" distL="0" distR="0">
-            <wp:extent cx="4762500" cy="2381250"/>
+            <wp:extent cx="4762500" cy="2571750"/>
             <wp:effectExtent l="0" t="0" r="0" b="0"/>
             <wp:docPr id="13" name="app-no-role.png" descr="A user without the required role is sent back to the login page&#10;A user without the required role is sent back to the login page"/>
             <wp:cNvGraphicFramePr>
@@ -3920,7 +3920,7 @@
                   <pic:spPr bwMode="auto">
                     <a:xfrm>
                       <a:off x="0" y="0"/>
-                      <a:ext cx="4762500" cy="2381250"/>
+                      <a:ext cx="4762500" cy="2571750"/>
                     </a:xfrm>
                     <a:prstGeom prst="rect">
                       <a:avLst/>
@@ -3968,7 +3968,7 @@
         <w:keepNext w:val="true"/>
         <w:rPr/>
       </w:pPr>
-      <w:bookmarkStart w:id="16" w:name="__RefHeading___Toc539_1834084466"/>
+      <w:bookmarkStart w:id="16" w:name="__RefHeading___Toc539_567877476"/>
       <w:bookmarkEnd w:id="16"/>
       <w:r>
         <w:rPr/>
@@ -4165,7 +4165,7 @@
         <w:keepNext w:val="true"/>
         <w:rPr/>
       </w:pPr>
-      <w:bookmarkStart w:id="17" w:name="__RefHeading___Toc541_1834084466"/>
+      <w:bookmarkStart w:id="17" w:name="__RefHeading___Toc541_567877476"/>
       <w:bookmarkEnd w:id="17"/>
       <w:r>
         <w:rPr/>
@@ -4333,7 +4333,7 @@
         <w:keepNext w:val="true"/>
         <w:rPr/>
       </w:pPr>
-      <w:bookmarkStart w:id="18" w:name="__RefHeading___Toc543_1834084466"/>
+      <w:bookmarkStart w:id="18" w:name="__RefHeading___Toc543_567877476"/>
       <w:bookmarkEnd w:id="18"/>
       <w:r>
         <w:rPr/>
@@ -5175,7 +5175,7 @@
         <w:keepNext w:val="true"/>
         <w:rPr/>
       </w:pPr>
-      <w:bookmarkStart w:id="19" w:name="__RefHeading___Toc545_1834084466"/>
+      <w:bookmarkStart w:id="19" w:name="__RefHeading___Toc545_567877476"/>
       <w:bookmarkEnd w:id="19"/>
       <w:r>
         <w:rPr/>
@@ -5682,7 +5682,7 @@
                 <w:sz w:val="20"/>
                 <w:szCs w:val="20"/>
               </w:rPr>
-              <w:t>Your session has ended. Sign in again.” right after signing in</w:t>
+              <w:t>Your account does not provide access. Contact your system administrator for details.” right after signing in</w:t>
             </w:r>
           </w:p>
         </w:tc>
@@ -5777,7 +5777,7 @@
                 <w:sz w:val="20"/>
                 <w:szCs w:val="20"/>
               </w:rPr>
-              <w:t>Your session has ended” after working for a while</w:t>
+              <w:t>Your session has ended. Sign in again.” after working for a while</w:t>
             </w:r>
           </w:p>
         </w:tc>

</xml_diff>